<commit_message>
Complete HotelHub coursework report coverage
</commit_message>
<xml_diff>
--- a/docs/HotelHub_Unit36_Application_Development_Adapted.docx
+++ b/docs/HotelHub_Unit36_Application_Development_Adapted.docx
@@ -2828,6 +2828,1107 @@
       </w:pPr>
     </w:p>
     <w:p>
+      <w:pPr/>
+      <w:r>
+        <w:t>Technical Documentation Summary</w:t>
+      </w:r>
+    </w:p>
+    <w:p>
+      <w:pPr/>
+      <w:r>
+        <w:t>The technical implementation is organized as a microservices monorepo. The frontend directory contains the Next.js App Router pages, TanStack Query data hooks, Zustand auth state and Socket.io client provider. The gateway directory contains the Express proxy that routes /api/v1 requests to Server 1 and /graphql requests to Server 2. Server 1 contains the Express REST API, JWT authentication, Prisma schema, booking/payment endpoints, Redis cache logic and Socket.io events. Server 2 contains the FastAPI application, Strawberry GraphQL schema, SQLAlchemy models, seed data and the internal room availability endpoint. Docker Compose connects these services with two PostgreSQL databases and Redis.</w:t>
+      </w:r>
+    </w:p>
+    <w:p>
+      <w:pPr/>
+    </w:p>
+    <w:p>
+      <w:pPr/>
+      <w:r>
+        <w:t>User Guide</w:t>
+      </w:r>
+    </w:p>
+    <w:p>
+      <w:pPr/>
+      <w:r>
+        <w:t>1. Register account: open Login / Register and create a guest account with name, email and password.</w:t>
+        <w:br/>
+        <w:t>2. Login: submit valid credentials so HotelHub stores the user profile and JWT tokens in the frontend auth state.</w:t>
+        <w:br/>
+        <w:t>3. Browse hotels: open Hotels to view the seeded hotel catalog loaded from the GraphQL service.</w:t>
+        <w:br/>
+        <w:t>4. Open room details: select View rooms, choose a room, and inspect price, capacity, image, description and availability.</w:t>
+        <w:br/>
+        <w:t>5. Create booking: confirm the default dates or select new dates, set guest count and press Confirm booking.</w:t>
+        <w:br/>
+        <w:t>6. View My Bookings: open My Bookings to review reservation history returned by the REST booking API.</w:t>
+        <w:br/>
+        <w:t>7. Cancel or delete booking: use Cancel to change status to CANCELLED, or Delete to remove an old booking record.</w:t>
+        <w:br/>
+        <w:t>8. Admin Dashboard: login as the seeded admin account to inspect all bookings, mark bookings completed, cancel reservations or delete guest bookings when administrative action is required.</w:t>
+      </w:r>
+    </w:p>
+    <w:p>
+      <w:pPr/>
+    </w:p>
+    <w:p>
+      <w:pPr/>
+      <w:r>
+        <w:t>Deployment Guide</w:t>
+      </w:r>
+    </w:p>
+    <w:p>
+      <w:pPr/>
+      <w:r>
+        <w:t>HotelHub is deployed locally through Docker Compose so all services run with consistent network names and environment variables. From the project root, the assessor or developer can start the full stack with:</w:t>
+      </w:r>
+    </w:p>
+    <w:p>
+      <w:pPr/>
+      <w:r>
+        <w:rPr>
+          <w:rFonts w:ascii="Courier New" w:hAnsi="Courier New"/>
+          <w:sz w:val="18"/>
+        </w:rPr>
+        <w:t>docker compose up --build</w:t>
+      </w:r>
+    </w:p>
+    <w:p>
+      <w:pPr/>
+      <w:r>
+        <w:t>After the containers finish building, the frontend is available at http://localhost:3000, the gateway at http://localhost:8080, Server 1 at http://localhost:4001, and Server 2/GraphQL at http://localhost:4002/graphql. Environment samples are provided through .env.example files in each service directory, and Docker Compose creates separate PostgreSQL databases plus Redis for session and availability storage.</w:t>
+      </w:r>
+    </w:p>
+    <w:p>
+      <w:pPr/>
+    </w:p>
+    <w:p>
+      <w:pPr/>
+      <w:r>
+        <w:t>Testing Documentation (Test Plan and Results)</w:t>
+      </w:r>
+    </w:p>
+    <w:p>
+      <w:pPr/>
+      <w:r>
+        <w:t>The following test plan validates the core HotelHub business flows required by the brief. Tests combine browser-based checking with API-level verification through the gateway, confirming that guest actions, admin controls, persistence and availability synchronization behave as expected.</w:t>
+      </w:r>
+    </w:p>
+    <w:tbl>
+      <w:tblPr>
+        <w:tblW w:type="auto" w:w="0"/>
+        <w:jc w:val="center"/>
+        <w:tblLook w:firstColumn="1" w:firstRow="1" w:lastColumn="0" w:lastRow="0" w:noHBand="0" w:noVBand="1" w:val="04A0"/>
+      </w:tblPr>
+      <w:tblGrid>
+        <w:gridCol w:w="2256"/>
+        <w:gridCol w:w="2256"/>
+        <w:gridCol w:w="2256"/>
+        <w:gridCol w:w="2256"/>
+      </w:tblGrid>
+      <w:tr>
+        <w:tc>
+          <w:tcPr>
+            <w:tcW w:type="dxa" w:w="2256"/>
+            <w:vAlign w:val="center"/>
+            <w:tcBorders>
+              <w:top w:val="single" w:sz="6" w:space="0" w:color="808080"/>
+              <w:left w:val="single" w:sz="6" w:space="0" w:color="808080"/>
+              <w:bottom w:val="single" w:sz="6" w:space="0" w:color="808080"/>
+              <w:right w:val="single" w:sz="6" w:space="0" w:color="808080"/>
+              <w:insideH w:val="single" w:sz="6" w:space="0" w:color="808080"/>
+              <w:insideV w:val="single" w:sz="6" w:space="0" w:color="808080"/>
+            </w:tcBorders>
+            <w:shd w:fill="D9EAF7"/>
+          </w:tcPr>
+          <w:p>
+            <w:r>
+              <w:rPr>
+                <w:b/>
+                <w:sz w:val="17"/>
+              </w:rPr>
+              <w:t>Test ID</w:t>
+            </w:r>
+          </w:p>
+        </w:tc>
+        <w:tc>
+          <w:tcPr>
+            <w:tcW w:type="dxa" w:w="2256"/>
+            <w:vAlign w:val="center"/>
+            <w:tcBorders>
+              <w:top w:val="single" w:sz="6" w:space="0" w:color="808080"/>
+              <w:left w:val="single" w:sz="6" w:space="0" w:color="808080"/>
+              <w:bottom w:val="single" w:sz="6" w:space="0" w:color="808080"/>
+              <w:right w:val="single" w:sz="6" w:space="0" w:color="808080"/>
+              <w:insideH w:val="single" w:sz="6" w:space="0" w:color="808080"/>
+              <w:insideV w:val="single" w:sz="6" w:space="0" w:color="808080"/>
+            </w:tcBorders>
+            <w:shd w:fill="D9EAF7"/>
+          </w:tcPr>
+          <w:p>
+            <w:r>
+              <w:rPr>
+                <w:b/>
+                <w:sz w:val="17"/>
+              </w:rPr>
+              <w:t>Action</w:t>
+            </w:r>
+          </w:p>
+        </w:tc>
+        <w:tc>
+          <w:tcPr>
+            <w:tcW w:type="dxa" w:w="2256"/>
+            <w:vAlign w:val="center"/>
+            <w:tcBorders>
+              <w:top w:val="single" w:sz="6" w:space="0" w:color="808080"/>
+              <w:left w:val="single" w:sz="6" w:space="0" w:color="808080"/>
+              <w:bottom w:val="single" w:sz="6" w:space="0" w:color="808080"/>
+              <w:right w:val="single" w:sz="6" w:space="0" w:color="808080"/>
+              <w:insideH w:val="single" w:sz="6" w:space="0" w:color="808080"/>
+              <w:insideV w:val="single" w:sz="6" w:space="0" w:color="808080"/>
+            </w:tcBorders>
+            <w:shd w:fill="D9EAF7"/>
+          </w:tcPr>
+          <w:p>
+            <w:r>
+              <w:rPr>
+                <w:b/>
+                <w:sz w:val="17"/>
+              </w:rPr>
+              <w:t>Expected</w:t>
+            </w:r>
+          </w:p>
+        </w:tc>
+        <w:tc>
+          <w:tcPr>
+            <w:tcW w:type="dxa" w:w="2256"/>
+            <w:vAlign w:val="center"/>
+            <w:tcBorders>
+              <w:top w:val="single" w:sz="6" w:space="0" w:color="808080"/>
+              <w:left w:val="single" w:sz="6" w:space="0" w:color="808080"/>
+              <w:bottom w:val="single" w:sz="6" w:space="0" w:color="808080"/>
+              <w:right w:val="single" w:sz="6" w:space="0" w:color="808080"/>
+              <w:insideH w:val="single" w:sz="6" w:space="0" w:color="808080"/>
+              <w:insideV w:val="single" w:sz="6" w:space="0" w:color="808080"/>
+            </w:tcBorders>
+            <w:shd w:fill="D9EAF7"/>
+          </w:tcPr>
+          <w:p>
+            <w:r>
+              <w:rPr>
+                <w:b/>
+                <w:sz w:val="17"/>
+              </w:rPr>
+              <w:t>Result</w:t>
+            </w:r>
+          </w:p>
+        </w:tc>
+      </w:tr>
+      <w:tr>
+        <w:tc>
+          <w:tcPr>
+            <w:tcW w:type="dxa" w:w="2256"/>
+            <w:vAlign w:val="center"/>
+            <w:tcBorders>
+              <w:top w:val="single" w:sz="6" w:space="0" w:color="808080"/>
+              <w:left w:val="single" w:sz="6" w:space="0" w:color="808080"/>
+              <w:bottom w:val="single" w:sz="6" w:space="0" w:color="808080"/>
+              <w:right w:val="single" w:sz="6" w:space="0" w:color="808080"/>
+              <w:insideH w:val="single" w:sz="6" w:space="0" w:color="808080"/>
+              <w:insideV w:val="single" w:sz="6" w:space="0" w:color="808080"/>
+            </w:tcBorders>
+          </w:tcPr>
+          <w:p>
+            <w:r>
+              <w:rPr>
+                <w:sz w:val="17"/>
+              </w:rPr>
+              <w:t>T1</w:t>
+            </w:r>
+          </w:p>
+        </w:tc>
+        <w:tc>
+          <w:tcPr>
+            <w:tcW w:type="dxa" w:w="2256"/>
+            <w:vAlign w:val="center"/>
+            <w:tcBorders>
+              <w:top w:val="single" w:sz="6" w:space="0" w:color="808080"/>
+              <w:left w:val="single" w:sz="6" w:space="0" w:color="808080"/>
+              <w:bottom w:val="single" w:sz="6" w:space="0" w:color="808080"/>
+              <w:right w:val="single" w:sz="6" w:space="0" w:color="808080"/>
+              <w:insideH w:val="single" w:sz="6" w:space="0" w:color="808080"/>
+              <w:insideV w:val="single" w:sz="6" w:space="0" w:color="808080"/>
+            </w:tcBorders>
+          </w:tcPr>
+          <w:p>
+            <w:r>
+              <w:rPr>
+                <w:sz w:val="17"/>
+              </w:rPr>
+              <w:t>Register a new guest account</w:t>
+            </w:r>
+          </w:p>
+        </w:tc>
+        <w:tc>
+          <w:tcPr>
+            <w:tcW w:type="dxa" w:w="2256"/>
+            <w:vAlign w:val="center"/>
+            <w:tcBorders>
+              <w:top w:val="single" w:sz="6" w:space="0" w:color="808080"/>
+              <w:left w:val="single" w:sz="6" w:space="0" w:color="808080"/>
+              <w:bottom w:val="single" w:sz="6" w:space="0" w:color="808080"/>
+              <w:right w:val="single" w:sz="6" w:space="0" w:color="808080"/>
+              <w:insideH w:val="single" w:sz="6" w:space="0" w:color="808080"/>
+              <w:insideV w:val="single" w:sz="6" w:space="0" w:color="808080"/>
+            </w:tcBorders>
+          </w:tcPr>
+          <w:p>
+            <w:r>
+              <w:rPr>
+                <w:sz w:val="17"/>
+              </w:rPr>
+              <w:t>Guest record is created and authentication tokens are returned</w:t>
+            </w:r>
+          </w:p>
+        </w:tc>
+        <w:tc>
+          <w:tcPr>
+            <w:tcW w:type="dxa" w:w="2256"/>
+            <w:vAlign w:val="center"/>
+            <w:tcBorders>
+              <w:top w:val="single" w:sz="6" w:space="0" w:color="808080"/>
+              <w:left w:val="single" w:sz="6" w:space="0" w:color="808080"/>
+              <w:bottom w:val="single" w:sz="6" w:space="0" w:color="808080"/>
+              <w:right w:val="single" w:sz="6" w:space="0" w:color="808080"/>
+              <w:insideH w:val="single" w:sz="6" w:space="0" w:color="808080"/>
+              <w:insideV w:val="single" w:sz="6" w:space="0" w:color="808080"/>
+            </w:tcBorders>
+          </w:tcPr>
+          <w:p>
+            <w:r>
+              <w:rPr>
+                <w:sz w:val="17"/>
+              </w:rPr>
+              <w:t>Pass</w:t>
+            </w:r>
+          </w:p>
+        </w:tc>
+      </w:tr>
+      <w:tr>
+        <w:tc>
+          <w:tcPr>
+            <w:tcW w:type="dxa" w:w="2256"/>
+            <w:vAlign w:val="center"/>
+            <w:tcBorders>
+              <w:top w:val="single" w:sz="6" w:space="0" w:color="808080"/>
+              <w:left w:val="single" w:sz="6" w:space="0" w:color="808080"/>
+              <w:bottom w:val="single" w:sz="6" w:space="0" w:color="808080"/>
+              <w:right w:val="single" w:sz="6" w:space="0" w:color="808080"/>
+              <w:insideH w:val="single" w:sz="6" w:space="0" w:color="808080"/>
+              <w:insideV w:val="single" w:sz="6" w:space="0" w:color="808080"/>
+            </w:tcBorders>
+          </w:tcPr>
+          <w:p>
+            <w:r>
+              <w:rPr>
+                <w:sz w:val="17"/>
+              </w:rPr>
+              <w:t>T2</w:t>
+            </w:r>
+          </w:p>
+        </w:tc>
+        <w:tc>
+          <w:tcPr>
+            <w:tcW w:type="dxa" w:w="2256"/>
+            <w:vAlign w:val="center"/>
+            <w:tcBorders>
+              <w:top w:val="single" w:sz="6" w:space="0" w:color="808080"/>
+              <w:left w:val="single" w:sz="6" w:space="0" w:color="808080"/>
+              <w:bottom w:val="single" w:sz="6" w:space="0" w:color="808080"/>
+              <w:right w:val="single" w:sz="6" w:space="0" w:color="808080"/>
+              <w:insideH w:val="single" w:sz="6" w:space="0" w:color="808080"/>
+              <w:insideV w:val="single" w:sz="6" w:space="0" w:color="808080"/>
+            </w:tcBorders>
+          </w:tcPr>
+          <w:p>
+            <w:r>
+              <w:rPr>
+                <w:sz w:val="17"/>
+              </w:rPr>
+              <w:t>Login with valid guest credentials</w:t>
+            </w:r>
+          </w:p>
+        </w:tc>
+        <w:tc>
+          <w:tcPr>
+            <w:tcW w:type="dxa" w:w="2256"/>
+            <w:vAlign w:val="center"/>
+            <w:tcBorders>
+              <w:top w:val="single" w:sz="6" w:space="0" w:color="808080"/>
+              <w:left w:val="single" w:sz="6" w:space="0" w:color="808080"/>
+              <w:bottom w:val="single" w:sz="6" w:space="0" w:color="808080"/>
+              <w:right w:val="single" w:sz="6" w:space="0" w:color="808080"/>
+              <w:insideH w:val="single" w:sz="6" w:space="0" w:color="808080"/>
+              <w:insideV w:val="single" w:sz="6" w:space="0" w:color="808080"/>
+            </w:tcBorders>
+          </w:tcPr>
+          <w:p>
+            <w:r>
+              <w:rPr>
+                <w:sz w:val="17"/>
+              </w:rPr>
+              <w:t>JWT access token, refresh token and user profile are returned</w:t>
+            </w:r>
+          </w:p>
+        </w:tc>
+        <w:tc>
+          <w:tcPr>
+            <w:tcW w:type="dxa" w:w="2256"/>
+            <w:vAlign w:val="center"/>
+            <w:tcBorders>
+              <w:top w:val="single" w:sz="6" w:space="0" w:color="808080"/>
+              <w:left w:val="single" w:sz="6" w:space="0" w:color="808080"/>
+              <w:bottom w:val="single" w:sz="6" w:space="0" w:color="808080"/>
+              <w:right w:val="single" w:sz="6" w:space="0" w:color="808080"/>
+              <w:insideH w:val="single" w:sz="6" w:space="0" w:color="808080"/>
+              <w:insideV w:val="single" w:sz="6" w:space="0" w:color="808080"/>
+            </w:tcBorders>
+          </w:tcPr>
+          <w:p>
+            <w:r>
+              <w:rPr>
+                <w:sz w:val="17"/>
+              </w:rPr>
+              <w:t>Pass</w:t>
+            </w:r>
+          </w:p>
+        </w:tc>
+      </w:tr>
+      <w:tr>
+        <w:tc>
+          <w:tcPr>
+            <w:tcW w:type="dxa" w:w="2256"/>
+            <w:vAlign w:val="center"/>
+            <w:tcBorders>
+              <w:top w:val="single" w:sz="6" w:space="0" w:color="808080"/>
+              <w:left w:val="single" w:sz="6" w:space="0" w:color="808080"/>
+              <w:bottom w:val="single" w:sz="6" w:space="0" w:color="808080"/>
+              <w:right w:val="single" w:sz="6" w:space="0" w:color="808080"/>
+              <w:insideH w:val="single" w:sz="6" w:space="0" w:color="808080"/>
+              <w:insideV w:val="single" w:sz="6" w:space="0" w:color="808080"/>
+            </w:tcBorders>
+          </w:tcPr>
+          <w:p>
+            <w:r>
+              <w:rPr>
+                <w:sz w:val="17"/>
+              </w:rPr>
+              <w:t>T3</w:t>
+            </w:r>
+          </w:p>
+        </w:tc>
+        <w:tc>
+          <w:tcPr>
+            <w:tcW w:type="dxa" w:w="2256"/>
+            <w:vAlign w:val="center"/>
+            <w:tcBorders>
+              <w:top w:val="single" w:sz="6" w:space="0" w:color="808080"/>
+              <w:left w:val="single" w:sz="6" w:space="0" w:color="808080"/>
+              <w:bottom w:val="single" w:sz="6" w:space="0" w:color="808080"/>
+              <w:right w:val="single" w:sz="6" w:space="0" w:color="808080"/>
+              <w:insideH w:val="single" w:sz="6" w:space="0" w:color="808080"/>
+              <w:insideV w:val="single" w:sz="6" w:space="0" w:color="808080"/>
+            </w:tcBorders>
+          </w:tcPr>
+          <w:p>
+            <w:r>
+              <w:rPr>
+                <w:sz w:val="17"/>
+              </w:rPr>
+              <w:t>Login with invalid password</w:t>
+            </w:r>
+          </w:p>
+        </w:tc>
+        <w:tc>
+          <w:tcPr>
+            <w:tcW w:type="dxa" w:w="2256"/>
+            <w:vAlign w:val="center"/>
+            <w:tcBorders>
+              <w:top w:val="single" w:sz="6" w:space="0" w:color="808080"/>
+              <w:left w:val="single" w:sz="6" w:space="0" w:color="808080"/>
+              <w:bottom w:val="single" w:sz="6" w:space="0" w:color="808080"/>
+              <w:right w:val="single" w:sz="6" w:space="0" w:color="808080"/>
+              <w:insideH w:val="single" w:sz="6" w:space="0" w:color="808080"/>
+              <w:insideV w:val="single" w:sz="6" w:space="0" w:color="808080"/>
+            </w:tcBorders>
+          </w:tcPr>
+          <w:p>
+            <w:r>
+              <w:rPr>
+                <w:sz w:val="17"/>
+              </w:rPr>
+              <w:t>API rejects credentials with an unauthorized response</w:t>
+            </w:r>
+          </w:p>
+        </w:tc>
+        <w:tc>
+          <w:tcPr>
+            <w:tcW w:type="dxa" w:w="2256"/>
+            <w:vAlign w:val="center"/>
+            <w:tcBorders>
+              <w:top w:val="single" w:sz="6" w:space="0" w:color="808080"/>
+              <w:left w:val="single" w:sz="6" w:space="0" w:color="808080"/>
+              <w:bottom w:val="single" w:sz="6" w:space="0" w:color="808080"/>
+              <w:right w:val="single" w:sz="6" w:space="0" w:color="808080"/>
+              <w:insideH w:val="single" w:sz="6" w:space="0" w:color="808080"/>
+              <w:insideV w:val="single" w:sz="6" w:space="0" w:color="808080"/>
+            </w:tcBorders>
+          </w:tcPr>
+          <w:p>
+            <w:r>
+              <w:rPr>
+                <w:sz w:val="17"/>
+              </w:rPr>
+              <w:t>Pass</w:t>
+            </w:r>
+          </w:p>
+        </w:tc>
+      </w:tr>
+      <w:tr>
+        <w:tc>
+          <w:tcPr>
+            <w:tcW w:type="dxa" w:w="2256"/>
+            <w:vAlign w:val="center"/>
+            <w:tcBorders>
+              <w:top w:val="single" w:sz="6" w:space="0" w:color="808080"/>
+              <w:left w:val="single" w:sz="6" w:space="0" w:color="808080"/>
+              <w:bottom w:val="single" w:sz="6" w:space="0" w:color="808080"/>
+              <w:right w:val="single" w:sz="6" w:space="0" w:color="808080"/>
+              <w:insideH w:val="single" w:sz="6" w:space="0" w:color="808080"/>
+              <w:insideV w:val="single" w:sz="6" w:space="0" w:color="808080"/>
+            </w:tcBorders>
+          </w:tcPr>
+          <w:p>
+            <w:r>
+              <w:rPr>
+                <w:sz w:val="17"/>
+              </w:rPr>
+              <w:t>T4</w:t>
+            </w:r>
+          </w:p>
+        </w:tc>
+        <w:tc>
+          <w:tcPr>
+            <w:tcW w:type="dxa" w:w="2256"/>
+            <w:vAlign w:val="center"/>
+            <w:tcBorders>
+              <w:top w:val="single" w:sz="6" w:space="0" w:color="808080"/>
+              <w:left w:val="single" w:sz="6" w:space="0" w:color="808080"/>
+              <w:bottom w:val="single" w:sz="6" w:space="0" w:color="808080"/>
+              <w:right w:val="single" w:sz="6" w:space="0" w:color="808080"/>
+              <w:insideH w:val="single" w:sz="6" w:space="0" w:color="808080"/>
+              <w:insideV w:val="single" w:sz="6" w:space="0" w:color="808080"/>
+            </w:tcBorders>
+          </w:tcPr>
+          <w:p>
+            <w:r>
+              <w:rPr>
+                <w:sz w:val="17"/>
+              </w:rPr>
+              <w:t>Open Hotel Catalog</w:t>
+            </w:r>
+          </w:p>
+        </w:tc>
+        <w:tc>
+          <w:tcPr>
+            <w:tcW w:type="dxa" w:w="2256"/>
+            <w:vAlign w:val="center"/>
+            <w:tcBorders>
+              <w:top w:val="single" w:sz="6" w:space="0" w:color="808080"/>
+              <w:left w:val="single" w:sz="6" w:space="0" w:color="808080"/>
+              <w:bottom w:val="single" w:sz="6" w:space="0" w:color="808080"/>
+              <w:right w:val="single" w:sz="6" w:space="0" w:color="808080"/>
+              <w:insideH w:val="single" w:sz="6" w:space="0" w:color="808080"/>
+              <w:insideV w:val="single" w:sz="6" w:space="0" w:color="808080"/>
+            </w:tcBorders>
+          </w:tcPr>
+          <w:p>
+            <w:r>
+              <w:rPr>
+                <w:sz w:val="17"/>
+              </w:rPr>
+              <w:t>Five seeded hotels load from the GraphQL catalog service</w:t>
+            </w:r>
+          </w:p>
+        </w:tc>
+        <w:tc>
+          <w:tcPr>
+            <w:tcW w:type="dxa" w:w="2256"/>
+            <w:vAlign w:val="center"/>
+            <w:tcBorders>
+              <w:top w:val="single" w:sz="6" w:space="0" w:color="808080"/>
+              <w:left w:val="single" w:sz="6" w:space="0" w:color="808080"/>
+              <w:bottom w:val="single" w:sz="6" w:space="0" w:color="808080"/>
+              <w:right w:val="single" w:sz="6" w:space="0" w:color="808080"/>
+              <w:insideH w:val="single" w:sz="6" w:space="0" w:color="808080"/>
+              <w:insideV w:val="single" w:sz="6" w:space="0" w:color="808080"/>
+            </w:tcBorders>
+          </w:tcPr>
+          <w:p>
+            <w:r>
+              <w:rPr>
+                <w:sz w:val="17"/>
+              </w:rPr>
+              <w:t>Pass</w:t>
+            </w:r>
+          </w:p>
+        </w:tc>
+      </w:tr>
+      <w:tr>
+        <w:tc>
+          <w:tcPr>
+            <w:tcW w:type="dxa" w:w="2256"/>
+            <w:vAlign w:val="center"/>
+            <w:tcBorders>
+              <w:top w:val="single" w:sz="6" w:space="0" w:color="808080"/>
+              <w:left w:val="single" w:sz="6" w:space="0" w:color="808080"/>
+              <w:bottom w:val="single" w:sz="6" w:space="0" w:color="808080"/>
+              <w:right w:val="single" w:sz="6" w:space="0" w:color="808080"/>
+              <w:insideH w:val="single" w:sz="6" w:space="0" w:color="808080"/>
+              <w:insideV w:val="single" w:sz="6" w:space="0" w:color="808080"/>
+            </w:tcBorders>
+          </w:tcPr>
+          <w:p>
+            <w:r>
+              <w:rPr>
+                <w:sz w:val="17"/>
+              </w:rPr>
+              <w:t>T5</w:t>
+            </w:r>
+          </w:p>
+        </w:tc>
+        <w:tc>
+          <w:tcPr>
+            <w:tcW w:type="dxa" w:w="2256"/>
+            <w:vAlign w:val="center"/>
+            <w:tcBorders>
+              <w:top w:val="single" w:sz="6" w:space="0" w:color="808080"/>
+              <w:left w:val="single" w:sz="6" w:space="0" w:color="808080"/>
+              <w:bottom w:val="single" w:sz="6" w:space="0" w:color="808080"/>
+              <w:right w:val="single" w:sz="6" w:space="0" w:color="808080"/>
+              <w:insideH w:val="single" w:sz="6" w:space="0" w:color="808080"/>
+              <w:insideV w:val="single" w:sz="6" w:space="0" w:color="808080"/>
+            </w:tcBorders>
+          </w:tcPr>
+          <w:p>
+            <w:r>
+              <w:rPr>
+                <w:sz w:val="17"/>
+              </w:rPr>
+              <w:t>Open Hotel Detail page</w:t>
+            </w:r>
+          </w:p>
+        </w:tc>
+        <w:tc>
+          <w:tcPr>
+            <w:tcW w:type="dxa" w:w="2256"/>
+            <w:vAlign w:val="center"/>
+            <w:tcBorders>
+              <w:top w:val="single" w:sz="6" w:space="0" w:color="808080"/>
+              <w:left w:val="single" w:sz="6" w:space="0" w:color="808080"/>
+              <w:bottom w:val="single" w:sz="6" w:space="0" w:color="808080"/>
+              <w:right w:val="single" w:sz="6" w:space="0" w:color="808080"/>
+              <w:insideH w:val="single" w:sz="6" w:space="0" w:color="808080"/>
+              <w:insideV w:val="single" w:sz="6" w:space="0" w:color="808080"/>
+            </w:tcBorders>
+          </w:tcPr>
+          <w:p>
+            <w:r>
+              <w:rPr>
+                <w:sz w:val="17"/>
+              </w:rPr>
+              <w:t>Rooms for the selected hotel are displayed with availability status</w:t>
+            </w:r>
+          </w:p>
+        </w:tc>
+        <w:tc>
+          <w:tcPr>
+            <w:tcW w:type="dxa" w:w="2256"/>
+            <w:vAlign w:val="center"/>
+            <w:tcBorders>
+              <w:top w:val="single" w:sz="6" w:space="0" w:color="808080"/>
+              <w:left w:val="single" w:sz="6" w:space="0" w:color="808080"/>
+              <w:bottom w:val="single" w:sz="6" w:space="0" w:color="808080"/>
+              <w:right w:val="single" w:sz="6" w:space="0" w:color="808080"/>
+              <w:insideH w:val="single" w:sz="6" w:space="0" w:color="808080"/>
+              <w:insideV w:val="single" w:sz="6" w:space="0" w:color="808080"/>
+            </w:tcBorders>
+          </w:tcPr>
+          <w:p>
+            <w:r>
+              <w:rPr>
+                <w:sz w:val="17"/>
+              </w:rPr>
+              <w:t>Pass</w:t>
+            </w:r>
+          </w:p>
+        </w:tc>
+      </w:tr>
+      <w:tr>
+        <w:tc>
+          <w:tcPr>
+            <w:tcW w:type="dxa" w:w="2256"/>
+            <w:vAlign w:val="center"/>
+            <w:tcBorders>
+              <w:top w:val="single" w:sz="6" w:space="0" w:color="808080"/>
+              <w:left w:val="single" w:sz="6" w:space="0" w:color="808080"/>
+              <w:bottom w:val="single" w:sz="6" w:space="0" w:color="808080"/>
+              <w:right w:val="single" w:sz="6" w:space="0" w:color="808080"/>
+              <w:insideH w:val="single" w:sz="6" w:space="0" w:color="808080"/>
+              <w:insideV w:val="single" w:sz="6" w:space="0" w:color="808080"/>
+            </w:tcBorders>
+          </w:tcPr>
+          <w:p>
+            <w:r>
+              <w:rPr>
+                <w:sz w:val="17"/>
+              </w:rPr>
+              <w:t>T6</w:t>
+            </w:r>
+          </w:p>
+        </w:tc>
+        <w:tc>
+          <w:tcPr>
+            <w:tcW w:type="dxa" w:w="2256"/>
+            <w:vAlign w:val="center"/>
+            <w:tcBorders>
+              <w:top w:val="single" w:sz="6" w:space="0" w:color="808080"/>
+              <w:left w:val="single" w:sz="6" w:space="0" w:color="808080"/>
+              <w:bottom w:val="single" w:sz="6" w:space="0" w:color="808080"/>
+              <w:right w:val="single" w:sz="6" w:space="0" w:color="808080"/>
+              <w:insideH w:val="single" w:sz="6" w:space="0" w:color="808080"/>
+              <w:insideV w:val="single" w:sz="6" w:space="0" w:color="808080"/>
+            </w:tcBorders>
+          </w:tcPr>
+          <w:p>
+            <w:r>
+              <w:rPr>
+                <w:sz w:val="17"/>
+              </w:rPr>
+              <w:t>Open Room Detail page</w:t>
+            </w:r>
+          </w:p>
+        </w:tc>
+        <w:tc>
+          <w:tcPr>
+            <w:tcW w:type="dxa" w:w="2256"/>
+            <w:vAlign w:val="center"/>
+            <w:tcBorders>
+              <w:top w:val="single" w:sz="6" w:space="0" w:color="808080"/>
+              <w:left w:val="single" w:sz="6" w:space="0" w:color="808080"/>
+              <w:bottom w:val="single" w:sz="6" w:space="0" w:color="808080"/>
+              <w:right w:val="single" w:sz="6" w:space="0" w:color="808080"/>
+              <w:insideH w:val="single" w:sz="6" w:space="0" w:color="808080"/>
+              <w:insideV w:val="single" w:sz="6" w:space="0" w:color="808080"/>
+            </w:tcBorders>
+          </w:tcPr>
+          <w:p>
+            <w:r>
+              <w:rPr>
+                <w:sz w:val="17"/>
+              </w:rPr>
+              <w:t>Check-in defaults to today and check-out defaults to tomorrow</w:t>
+            </w:r>
+          </w:p>
+        </w:tc>
+        <w:tc>
+          <w:tcPr>
+            <w:tcW w:type="dxa" w:w="2256"/>
+            <w:vAlign w:val="center"/>
+            <w:tcBorders>
+              <w:top w:val="single" w:sz="6" w:space="0" w:color="808080"/>
+              <w:left w:val="single" w:sz="6" w:space="0" w:color="808080"/>
+              <w:bottom w:val="single" w:sz="6" w:space="0" w:color="808080"/>
+              <w:right w:val="single" w:sz="6" w:space="0" w:color="808080"/>
+              <w:insideH w:val="single" w:sz="6" w:space="0" w:color="808080"/>
+              <w:insideV w:val="single" w:sz="6" w:space="0" w:color="808080"/>
+            </w:tcBorders>
+          </w:tcPr>
+          <w:p>
+            <w:r>
+              <w:rPr>
+                <w:sz w:val="17"/>
+              </w:rPr>
+              <w:t>Pass</w:t>
+            </w:r>
+          </w:p>
+        </w:tc>
+      </w:tr>
+      <w:tr>
+        <w:tc>
+          <w:tcPr>
+            <w:tcW w:type="dxa" w:w="2256"/>
+            <w:vAlign w:val="center"/>
+            <w:tcBorders>
+              <w:top w:val="single" w:sz="6" w:space="0" w:color="808080"/>
+              <w:left w:val="single" w:sz="6" w:space="0" w:color="808080"/>
+              <w:bottom w:val="single" w:sz="6" w:space="0" w:color="808080"/>
+              <w:right w:val="single" w:sz="6" w:space="0" w:color="808080"/>
+              <w:insideH w:val="single" w:sz="6" w:space="0" w:color="808080"/>
+              <w:insideV w:val="single" w:sz="6" w:space="0" w:color="808080"/>
+            </w:tcBorders>
+          </w:tcPr>
+          <w:p>
+            <w:r>
+              <w:rPr>
+                <w:sz w:val="17"/>
+              </w:rPr>
+              <w:t>T7</w:t>
+            </w:r>
+          </w:p>
+        </w:tc>
+        <w:tc>
+          <w:tcPr>
+            <w:tcW w:type="dxa" w:w="2256"/>
+            <w:vAlign w:val="center"/>
+            <w:tcBorders>
+              <w:top w:val="single" w:sz="6" w:space="0" w:color="808080"/>
+              <w:left w:val="single" w:sz="6" w:space="0" w:color="808080"/>
+              <w:bottom w:val="single" w:sz="6" w:space="0" w:color="808080"/>
+              <w:right w:val="single" w:sz="6" w:space="0" w:color="808080"/>
+              <w:insideH w:val="single" w:sz="6" w:space="0" w:color="808080"/>
+              <w:insideV w:val="single" w:sz="6" w:space="0" w:color="808080"/>
+            </w:tcBorders>
+          </w:tcPr>
+          <w:p>
+            <w:r>
+              <w:rPr>
+                <w:sz w:val="17"/>
+              </w:rPr>
+              <w:t>Create booking as authenticated guest</w:t>
+            </w:r>
+          </w:p>
+        </w:tc>
+        <w:tc>
+          <w:tcPr>
+            <w:tcW w:type="dxa" w:w="2256"/>
+            <w:vAlign w:val="center"/>
+            <w:tcBorders>
+              <w:top w:val="single" w:sz="6" w:space="0" w:color="808080"/>
+              <w:left w:val="single" w:sz="6" w:space="0" w:color="808080"/>
+              <w:bottom w:val="single" w:sz="6" w:space="0" w:color="808080"/>
+              <w:right w:val="single" w:sz="6" w:space="0" w:color="808080"/>
+              <w:insideH w:val="single" w:sz="6" w:space="0" w:color="808080"/>
+              <w:insideV w:val="single" w:sz="6" w:space="0" w:color="808080"/>
+            </w:tcBorders>
+          </w:tcPr>
+          <w:p>
+            <w:r>
+              <w:rPr>
+                <w:sz w:val="17"/>
+              </w:rPr>
+              <w:t>Booking is saved in PostgreSQL and status becomes CONFIRMED</w:t>
+            </w:r>
+          </w:p>
+        </w:tc>
+        <w:tc>
+          <w:tcPr>
+            <w:tcW w:type="dxa" w:w="2256"/>
+            <w:vAlign w:val="center"/>
+            <w:tcBorders>
+              <w:top w:val="single" w:sz="6" w:space="0" w:color="808080"/>
+              <w:left w:val="single" w:sz="6" w:space="0" w:color="808080"/>
+              <w:bottom w:val="single" w:sz="6" w:space="0" w:color="808080"/>
+              <w:right w:val="single" w:sz="6" w:space="0" w:color="808080"/>
+              <w:insideH w:val="single" w:sz="6" w:space="0" w:color="808080"/>
+              <w:insideV w:val="single" w:sz="6" w:space="0" w:color="808080"/>
+            </w:tcBorders>
+          </w:tcPr>
+          <w:p>
+            <w:r>
+              <w:rPr>
+                <w:sz w:val="17"/>
+              </w:rPr>
+              <w:t>Pass</w:t>
+            </w:r>
+          </w:p>
+        </w:tc>
+      </w:tr>
+      <w:tr>
+        <w:tc>
+          <w:tcPr>
+            <w:tcW w:type="dxa" w:w="2256"/>
+            <w:vAlign w:val="center"/>
+            <w:tcBorders>
+              <w:top w:val="single" w:sz="6" w:space="0" w:color="808080"/>
+              <w:left w:val="single" w:sz="6" w:space="0" w:color="808080"/>
+              <w:bottom w:val="single" w:sz="6" w:space="0" w:color="808080"/>
+              <w:right w:val="single" w:sz="6" w:space="0" w:color="808080"/>
+              <w:insideH w:val="single" w:sz="6" w:space="0" w:color="808080"/>
+              <w:insideV w:val="single" w:sz="6" w:space="0" w:color="808080"/>
+            </w:tcBorders>
+          </w:tcPr>
+          <w:p>
+            <w:r>
+              <w:rPr>
+                <w:sz w:val="17"/>
+              </w:rPr>
+              <w:t>T8</w:t>
+            </w:r>
+          </w:p>
+        </w:tc>
+        <w:tc>
+          <w:tcPr>
+            <w:tcW w:type="dxa" w:w="2256"/>
+            <w:vAlign w:val="center"/>
+            <w:tcBorders>
+              <w:top w:val="single" w:sz="6" w:space="0" w:color="808080"/>
+              <w:left w:val="single" w:sz="6" w:space="0" w:color="808080"/>
+              <w:bottom w:val="single" w:sz="6" w:space="0" w:color="808080"/>
+              <w:right w:val="single" w:sz="6" w:space="0" w:color="808080"/>
+              <w:insideH w:val="single" w:sz="6" w:space="0" w:color="808080"/>
+              <w:insideV w:val="single" w:sz="6" w:space="0" w:color="808080"/>
+            </w:tcBorders>
+          </w:tcPr>
+          <w:p>
+            <w:r>
+              <w:rPr>
+                <w:sz w:val="17"/>
+              </w:rPr>
+              <w:t>Verify room availability after booking</w:t>
+            </w:r>
+          </w:p>
+        </w:tc>
+        <w:tc>
+          <w:tcPr>
+            <w:tcW w:type="dxa" w:w="2256"/>
+            <w:vAlign w:val="center"/>
+            <w:tcBorders>
+              <w:top w:val="single" w:sz="6" w:space="0" w:color="808080"/>
+              <w:left w:val="single" w:sz="6" w:space="0" w:color="808080"/>
+              <w:bottom w:val="single" w:sz="6" w:space="0" w:color="808080"/>
+              <w:right w:val="single" w:sz="6" w:space="0" w:color="808080"/>
+              <w:insideH w:val="single" w:sz="6" w:space="0" w:color="808080"/>
+              <w:insideV w:val="single" w:sz="6" w:space="0" w:color="808080"/>
+            </w:tcBorders>
+          </w:tcPr>
+          <w:p>
+            <w:r>
+              <w:rPr>
+                <w:sz w:val="17"/>
+              </w:rPr>
+              <w:t>Redis availability cache and Server 2 room availability update to unavailable</w:t>
+            </w:r>
+          </w:p>
+        </w:tc>
+        <w:tc>
+          <w:tcPr>
+            <w:tcW w:type="dxa" w:w="2256"/>
+            <w:vAlign w:val="center"/>
+            <w:tcBorders>
+              <w:top w:val="single" w:sz="6" w:space="0" w:color="808080"/>
+              <w:left w:val="single" w:sz="6" w:space="0" w:color="808080"/>
+              <w:bottom w:val="single" w:sz="6" w:space="0" w:color="808080"/>
+              <w:right w:val="single" w:sz="6" w:space="0" w:color="808080"/>
+              <w:insideH w:val="single" w:sz="6" w:space="0" w:color="808080"/>
+              <w:insideV w:val="single" w:sz="6" w:space="0" w:color="808080"/>
+            </w:tcBorders>
+          </w:tcPr>
+          <w:p>
+            <w:r>
+              <w:rPr>
+                <w:sz w:val="17"/>
+              </w:rPr>
+              <w:t>Pass</w:t>
+            </w:r>
+          </w:p>
+        </w:tc>
+      </w:tr>
+      <w:tr>
+        <w:tc>
+          <w:tcPr>
+            <w:tcW w:type="dxa" w:w="2256"/>
+            <w:vAlign w:val="center"/>
+            <w:tcBorders>
+              <w:top w:val="single" w:sz="6" w:space="0" w:color="808080"/>
+              <w:left w:val="single" w:sz="6" w:space="0" w:color="808080"/>
+              <w:bottom w:val="single" w:sz="6" w:space="0" w:color="808080"/>
+              <w:right w:val="single" w:sz="6" w:space="0" w:color="808080"/>
+              <w:insideH w:val="single" w:sz="6" w:space="0" w:color="808080"/>
+              <w:insideV w:val="single" w:sz="6" w:space="0" w:color="808080"/>
+            </w:tcBorders>
+          </w:tcPr>
+          <w:p>
+            <w:r>
+              <w:rPr>
+                <w:sz w:val="17"/>
+              </w:rPr>
+              <w:t>T9</w:t>
+            </w:r>
+          </w:p>
+        </w:tc>
+        <w:tc>
+          <w:tcPr>
+            <w:tcW w:type="dxa" w:w="2256"/>
+            <w:vAlign w:val="center"/>
+            <w:tcBorders>
+              <w:top w:val="single" w:sz="6" w:space="0" w:color="808080"/>
+              <w:left w:val="single" w:sz="6" w:space="0" w:color="808080"/>
+              <w:bottom w:val="single" w:sz="6" w:space="0" w:color="808080"/>
+              <w:right w:val="single" w:sz="6" w:space="0" w:color="808080"/>
+              <w:insideH w:val="single" w:sz="6" w:space="0" w:color="808080"/>
+              <w:insideV w:val="single" w:sz="6" w:space="0" w:color="808080"/>
+            </w:tcBorders>
+          </w:tcPr>
+          <w:p>
+            <w:r>
+              <w:rPr>
+                <w:sz w:val="17"/>
+              </w:rPr>
+              <w:t>Cancel booking from My Bookings</w:t>
+            </w:r>
+          </w:p>
+        </w:tc>
+        <w:tc>
+          <w:tcPr>
+            <w:tcW w:type="dxa" w:w="2256"/>
+            <w:vAlign w:val="center"/>
+            <w:tcBorders>
+              <w:top w:val="single" w:sz="6" w:space="0" w:color="808080"/>
+              <w:left w:val="single" w:sz="6" w:space="0" w:color="808080"/>
+              <w:bottom w:val="single" w:sz="6" w:space="0" w:color="808080"/>
+              <w:right w:val="single" w:sz="6" w:space="0" w:color="808080"/>
+              <w:insideH w:val="single" w:sz="6" w:space="0" w:color="808080"/>
+              <w:insideV w:val="single" w:sz="6" w:space="0" w:color="808080"/>
+            </w:tcBorders>
+          </w:tcPr>
+          <w:p>
+            <w:r>
+              <w:rPr>
+                <w:sz w:val="17"/>
+              </w:rPr>
+              <w:t>Booking status changes to CANCELLED and room availability is restored</w:t>
+            </w:r>
+          </w:p>
+        </w:tc>
+        <w:tc>
+          <w:tcPr>
+            <w:tcW w:type="dxa" w:w="2256"/>
+            <w:vAlign w:val="center"/>
+            <w:tcBorders>
+              <w:top w:val="single" w:sz="6" w:space="0" w:color="808080"/>
+              <w:left w:val="single" w:sz="6" w:space="0" w:color="808080"/>
+              <w:bottom w:val="single" w:sz="6" w:space="0" w:color="808080"/>
+              <w:right w:val="single" w:sz="6" w:space="0" w:color="808080"/>
+              <w:insideH w:val="single" w:sz="6" w:space="0" w:color="808080"/>
+              <w:insideV w:val="single" w:sz="6" w:space="0" w:color="808080"/>
+            </w:tcBorders>
+          </w:tcPr>
+          <w:p>
+            <w:r>
+              <w:rPr>
+                <w:sz w:val="17"/>
+              </w:rPr>
+              <w:t>Pass</w:t>
+            </w:r>
+          </w:p>
+        </w:tc>
+      </w:tr>
+      <w:tr>
+        <w:tc>
+          <w:tcPr>
+            <w:tcW w:type="dxa" w:w="2256"/>
+            <w:vAlign w:val="center"/>
+            <w:tcBorders>
+              <w:top w:val="single" w:sz="6" w:space="0" w:color="808080"/>
+              <w:left w:val="single" w:sz="6" w:space="0" w:color="808080"/>
+              <w:bottom w:val="single" w:sz="6" w:space="0" w:color="808080"/>
+              <w:right w:val="single" w:sz="6" w:space="0" w:color="808080"/>
+              <w:insideH w:val="single" w:sz="6" w:space="0" w:color="808080"/>
+              <w:insideV w:val="single" w:sz="6" w:space="0" w:color="808080"/>
+            </w:tcBorders>
+          </w:tcPr>
+          <w:p>
+            <w:r>
+              <w:rPr>
+                <w:sz w:val="17"/>
+              </w:rPr>
+              <w:t>T10</w:t>
+            </w:r>
+          </w:p>
+        </w:tc>
+        <w:tc>
+          <w:tcPr>
+            <w:tcW w:type="dxa" w:w="2256"/>
+            <w:vAlign w:val="center"/>
+            <w:tcBorders>
+              <w:top w:val="single" w:sz="6" w:space="0" w:color="808080"/>
+              <w:left w:val="single" w:sz="6" w:space="0" w:color="808080"/>
+              <w:bottom w:val="single" w:sz="6" w:space="0" w:color="808080"/>
+              <w:right w:val="single" w:sz="6" w:space="0" w:color="808080"/>
+              <w:insideH w:val="single" w:sz="6" w:space="0" w:color="808080"/>
+              <w:insideV w:val="single" w:sz="6" w:space="0" w:color="808080"/>
+            </w:tcBorders>
+          </w:tcPr>
+          <w:p>
+            <w:r>
+              <w:rPr>
+                <w:sz w:val="17"/>
+              </w:rPr>
+              <w:t>Admin deletes another user booking</w:t>
+            </w:r>
+          </w:p>
+        </w:tc>
+        <w:tc>
+          <w:tcPr>
+            <w:tcW w:type="dxa" w:w="2256"/>
+            <w:vAlign w:val="center"/>
+            <w:tcBorders>
+              <w:top w:val="single" w:sz="6" w:space="0" w:color="808080"/>
+              <w:left w:val="single" w:sz="6" w:space="0" w:color="808080"/>
+              <w:bottom w:val="single" w:sz="6" w:space="0" w:color="808080"/>
+              <w:right w:val="single" w:sz="6" w:space="0" w:color="808080"/>
+              <w:insideH w:val="single" w:sz="6" w:space="0" w:color="808080"/>
+              <w:insideV w:val="single" w:sz="6" w:space="0" w:color="808080"/>
+            </w:tcBorders>
+          </w:tcPr>
+          <w:p>
+            <w:r>
+              <w:rPr>
+                <w:sz w:val="17"/>
+              </w:rPr>
+              <w:t>Admin Dashboard removes the booking using role-authorized REST control</w:t>
+            </w:r>
+          </w:p>
+        </w:tc>
+        <w:tc>
+          <w:tcPr>
+            <w:tcW w:type="dxa" w:w="2256"/>
+            <w:vAlign w:val="center"/>
+            <w:tcBorders>
+              <w:top w:val="single" w:sz="6" w:space="0" w:color="808080"/>
+              <w:left w:val="single" w:sz="6" w:space="0" w:color="808080"/>
+              <w:bottom w:val="single" w:sz="6" w:space="0" w:color="808080"/>
+              <w:right w:val="single" w:sz="6" w:space="0" w:color="808080"/>
+              <w:insideH w:val="single" w:sz="6" w:space="0" w:color="808080"/>
+              <w:insideV w:val="single" w:sz="6" w:space="0" w:color="808080"/>
+            </w:tcBorders>
+          </w:tcPr>
+          <w:p>
+            <w:r>
+              <w:rPr>
+                <w:sz w:val="17"/>
+              </w:rPr>
+              <w:t>Pass</w:t>
+            </w:r>
+          </w:p>
+        </w:tc>
+      </w:tr>
+    </w:tbl>
+    <w:p>
+      <w:pPr/>
+    </w:p>
+    <w:p>
       <w:pPr>
         <w:pStyle w:val="2"/>
         <w:bidi w:val="0"/>
@@ -3581,6 +4682,20 @@
         </w:rPr>
       </w:pPr>
     </w:p>
+    <w:p/>
+    <w:p/>
+    <w:p/>
+    <w:p/>
+    <w:p/>
+    <w:p/>
+    <w:p/>
+    <w:p/>
+    <w:p/>
+    <w:p/>
+    <w:p/>
+    <w:p/>
+    <w:p/>
+    <w:p/>
     <w:sectPr>
       <w:pgSz w:w="11906" w:h="16838"/>
       <w:cols w:space="720" w:num="1"/>

</xml_diff>